<commit_message>
Tambah folder contoh terisi; nama satu baris; judul tabel/gambar; proposal sampai Bab III
- contoh/: proposal, seminar hasil, skripsi terisi (data fiktif) + PDF/Word di contoh/hasil
- menu.sh dan word/buat_word.py: dokumen contoh-proposal/contoh-hasil/contoh-skripsi
- nama pada persetujuan/pengesahan selalu satu baris (PDF: adjustbox; Word: ukuran menyesuaikan)
- judul tabel atas-tengah, judul gambar bawah-tengah
- proposal hanya sampai Bab III; jadwal pelaksanaan menjadi subbab Bab III

Co-Authored-By: Claude Sonnet 5.5 <noreply@anthropic.com>
</commit_message>
<xml_diff>
--- a/hasil/proposal.docx
+++ b/hasil/proposal.docx
@@ -2416,10 +2416,26 @@
     </w:p>
     <w:p>
       <w:pPr>
+        <w:pStyle w:val="Heading2"/>
+      </w:pPr>
+      <w:bookmarkStart w:id="34" w:name="_745079744e8d85bd10cd2e4d1c8f81917e3b0ba"/>
+      <w:r>
+        <w:t xml:space="preserve">3.1</w:t>
+      </w:r>
+      <w:r>
+        <w:tab/>
+      </w:r>
+      <w:r>
+        <w:t xml:space="preserve">Perancangan dan Pengujian</w:t>
+      </w:r>
+      <w:bookmarkEnd w:id="34"/>
+    </w:p>
+    <w:p>
+      <w:pPr>
         <w:pStyle w:val="FirstParagraph"/>
       </w:pPr>
       <w:r>
-        <w:t xml:space="preserve">Bagian ini menjelaskan perancangan sistem yang digunakan, cara mengimplementasikan rancangan, dan cara pengujian sistem (indikator kinerja dan cara mengukurnya). Penjelasan ini bisa terdiri dari beberapa bab yang saling terkait.</w:t>
+        <w:t xml:space="preserve">Bagian ini menjelaskan perancangan sistem yang digunakan, cara mengimplementasikan rancangan, dan cara pengujian sistem (indikator kinerja dan cara mengukurnya). Penjelasan ini bisa terdiri dari beberapa subbab yang saling terkait.</w:t>
       </w:r>
     </w:p>
     <w:p>
@@ -2442,34 +2458,19 @@
     </w:p>
     <w:p>
       <w:pPr>
-        <w:pStyle w:val="Tengah"/>
-        <w:sectPr>
-          <w:headerReference w:type="default" r:id="rIdHeaderNomor"/>
-          <w:footerReference w:type="default" r:id="rIdFooterKosong"/>
-          <w:footerReference w:type="first" r:id="rIdFooterNomor"/>
-          <w:type w:val="nextPage"/>
-          <w:pgSz w:w="11906" w:h="16838"/>
-          <w:pgMar w:top="2268" w:right="1701" w:bottom="1701" w:left="2268" w:header="851" w:footer="709" w:gutter="0"/>
-          <w:pgNumType w:fmt="decimal"/>
-          <w:titlePg/>
-        </w:sectPr>
-      </w:pPr>
-    </w:p>
-    <w:p>
-      <w:pPr>
-        <w:pStyle w:val="Heading1"/>
-      </w:pPr>
-      <w:bookmarkStart w:id="34" w:name="_823f9e870831c1355639189ca2371e770728f16"/>
-      <w:r>
-        <w:t xml:space="preserve">BAB IV</w:t>
-      </w:r>
-      <w:r>
-        <w:br/>
-      </w:r>
-      <w:r>
-        <w:t xml:space="preserve">JADWAL PELAKSANAAN</w:t>
-      </w:r>
-      <w:bookmarkEnd w:id="34"/>
+        <w:pStyle w:val="Heading2"/>
+      </w:pPr>
+      <w:bookmarkStart w:id="35" w:name="_823f9e870831c1355639189ca2371e770728f16"/>
+      <w:r>
+        <w:t xml:space="preserve">3.2</w:t>
+      </w:r>
+      <w:r>
+        <w:tab/>
+      </w:r>
+      <w:r>
+        <w:t xml:space="preserve">Jadwal Pelaksanaan</w:t>
+      </w:r>
+      <w:bookmarkEnd w:id="35"/>
     </w:p>
     <w:p>
       <w:pPr>
@@ -2484,7 +2485,7 @@
         <w:pStyle w:val="TableCaption"/>
       </w:pPr>
       <w:r>
-        <w:t xml:space="preserve">Tabel 4.1. Jadwal pelaksanaan penelitian</w:t>
+        <w:t xml:space="preserve">Tabel 3.1. Jadwal pelaksanaan penelitian</w:t>
       </w:r>
     </w:p>
     <w:tbl>
@@ -2493,7 +2494,7 @@
         <w:tblW w:type="pct" w:w="5000"/>
         <w:tblLayout w:type="fixed"/>
         <w:tblLook w:firstRow="1" w:lastRow="0" w:firstColumn="0" w:lastColumn="0" w:noHBand="0" w:noVBand="0" w:val="0020"/>
-        <w:tblCaption w:val="Tabel 4.1. Jadwal pelaksanaan penelitian"/>
+        <w:tblCaption w:val="Tabel 3.1. Jadwal pelaksanaan penelitian"/>
       </w:tblPr>
       <w:tblGrid>
         <w:gridCol w:w="550"/>
@@ -3233,11 +3234,11 @@
       <w:pPr>
         <w:pStyle w:val="Heading1"/>
       </w:pPr>
-      <w:bookmarkStart w:id="35" w:name="_c8bc7b37742d03aae254d1c427781b8b5aca2ff"/>
+      <w:bookmarkStart w:id="36" w:name="_c8bc7b37742d03aae254d1c427781b8b5aca2ff"/>
       <w:r>
         <w:t xml:space="preserve">DAFTAR PUSTAKA</w:t>
       </w:r>
-      <w:bookmarkEnd w:id="35"/>
+      <w:bookmarkEnd w:id="36"/>
     </w:p>
     <w:p>
       <w:pPr>
@@ -3512,7 +3513,7 @@
       <w:r>
         <w:t xml:space="preserve"> </w:t>
       </w:r>
-      <w:hyperlink r:id="rId36">
+      <w:hyperlink r:id="rId37">
         <w:r>
           <w:rPr>
             <w:rStyle w:val="Hyperlink"/>
@@ -3592,7 +3593,7 @@
       <w:r>
         <w:t xml:space="preserve"> </w:t>
       </w:r>
-      <w:hyperlink r:id="rId37">
+      <w:hyperlink r:id="rId38">
         <w:r>
           <w:rPr>
             <w:rStyle w:val="Hyperlink"/>
@@ -3666,7 +3667,7 @@
       <w:r>
         <w:t xml:space="preserve"> </w:t>
       </w:r>
-      <w:hyperlink r:id="rId38">
+      <w:hyperlink r:id="rId39">
         <w:r>
           <w:rPr>
             <w:rStyle w:val="Hyperlink"/>
@@ -3698,7 +3699,7 @@
       <w:r>
         <w:t xml:space="preserve"> </w:t>
       </w:r>
-      <w:hyperlink r:id="rId39">
+      <w:hyperlink r:id="rId40">
         <w:r>
           <w:rPr>
             <w:rStyle w:val="Hyperlink"/>
@@ -3730,7 +3731,7 @@
       <w:r>
         <w:t xml:space="preserve"> </w:t>
       </w:r>
-      <w:hyperlink r:id="rId40">
+      <w:hyperlink r:id="rId41">
         <w:r>
           <w:rPr>
             <w:rStyle w:val="Hyperlink"/>
@@ -3765,7 +3766,7 @@
       <w:r>
         <w:t xml:space="preserve"> </w:t>
       </w:r>
-      <w:hyperlink r:id="rId41">
+      <w:hyperlink r:id="rId42">
         <w:r>
           <w:rPr>
             <w:rStyle w:val="Hyperlink"/>
@@ -4855,7 +4856,7 @@
     <w:pPr>
       <w:keepNext/>
       <w:spacing w:before="120" w:after="120" w:line="240" w:lineRule="auto"/>
-      <w:jc w:val="left"/>
+      <w:jc w:val="center"/>
     </w:pPr>
   </w:style>
   <w:style w:type="paragraph" w:customStyle="1" w:styleId="ImageCaption">

</xml_diff>